<commit_message>
fix: replace out-of-scope vocab with valid L1-L6 Hanlin words and regenerate layouts
</commit_message>
<xml_diff>
--- a/期中評量_排版版.docx
+++ b/期中評量_排版版.docx
@@ -57,7 +57,7 @@
         <w:rPr>
           <w:sz w:val="24"/>
         </w:rPr>
-        <w:t xml:space="preserve">　　臺中梧棲的【中正國小】即將舉辦校慶，四年級各班都在操場上集合。小明【彷】（　）彿是一隻【鷹】（　），在跑道上全力【衝】（　）刺。沒想到，在交接棒時，他【竟】（　）然不小心失誤，把棒子掉在地上。全場觀眾發出驚【訝】（　）的聲音，小明也感到十分【恐】（　）懼與自責。</w:t>
+        <w:t xml:space="preserve">　　臺中梧棲的【中正國小】即將舉辦校慶，四年級各班都在操場上集合。小明【彷】（　）彿是一隻【鷹】（　），在跑道上全力【衝】（　）刺。沒想到，在交接棒時，他【竟】（　）然不小心失誤，把棒子掉在地上。全場觀眾發出驚【訝】（　）的聲音，小明也感到十分自責與難過。</w:t>
       </w:r>
     </w:p>
     <w:p>
@@ -65,7 +65,7 @@
         <w:rPr>
           <w:sz w:val="24"/>
         </w:rPr>
-        <w:t xml:space="preserve">　　比賽結束後，小明沮喪的坐在【樹】（　）下，眼淚像是斷了線的珍【珠】（　）般掉落。同學們見【狀】（　），不但沒有責怪他，反而成群結【隊】（　）的走過來。班長輕輕拍著他的肩膀說：「別難過，我們是一個團體，要一起承擔。」小明聽了，原本【寧】（　）靜的心中感受到一絲溫暖。他努力【控】（　）【制】（　）住自己的情緒，擦乾眼淚。</w:t>
+        <w:t xml:space="preserve">　　比賽結束後，小明沮喪的坐在大樹下，眼淚像【斷】（　）了線一般掉落。同學們【看】（　）見了，不但沒有責怪他，反而成群結【隊】（　）的走過來。班長輕輕拍著他的肩膀說：「別難過，我們是一個團體，要一起承擔。」小明聽了，原本不平【靜】（　）的心中感受到一絲溫暖。他努力【控】（　）【制】（　）住自己的情緒，擦乾眼淚。</w:t>
       </w:r>
     </w:p>
     <w:p>
@@ -73,7 +73,7 @@
         <w:rPr>
           <w:sz w:val="24"/>
         </w:rPr>
-        <w:t xml:space="preserve">　　這次的失敗，就像是刻在石【碑】（　）上的教訓。小明學會了面對挫折，並決定要更加倍的練習。每天放學後，他都會留在操場上【巡】（　）視跑道，反覆練習接棒動作，直到汗水濕透了衣服。他相信，只要堅持下去，未來的日子一定會更加【甜】（　）蜜。</w:t>
+        <w:t xml:space="preserve">　　這次的失敗，就像是刻在石【碑】（　）上的教訓。小明學會了面對挫折，並決定要更加倍的練習。每天放學後，他都會留在操場上，尋【找】（　）最好的接棒時機，反覆練習動作，直到汗水濕透了衣服。他相信，只要堅【持】（　）下去，未來的日子一定會更加【甜】（　）蜜。</w:t>
       </w:r>
     </w:p>
     <w:p/>

</xml_diff>